<commit_message>
Approvazione prima versione e formattazione (come da Drive)
</commit_message>
<xml_diff>
--- a/RTB/Glossario/Glossario.docx
+++ b/RTB/Glossario/Glossario.docx
@@ -1928,6 +1928,1267 @@
           <w:szCs w:val="32"/>
           <w:rtl w:val="0"/>
         </w:rPr>
+        <w:t xml:space="preserve">Sommario</w:t>
+      </w:r>
+    </w:p>
+    <w:sdt>
+      <w:sdtPr>
+        <w:docPartObj>
+          <w:docPartGallery w:val="Table of Contents"/>
+          <w:docPartUnique w:val="1"/>
+        </w:docPartObj>
+      </w:sdtPr>
+      <w:sdtContent>
+        <w:p>
+          <w:pPr>
+            <w:tabs>
+              <w:tab w:val="right" w:pos="9025.511811023624"/>
+            </w:tabs>
+            <w:spacing w:before="80" w:line="240" w:lineRule="auto"/>
+            <w:ind w:left="0" w:firstLine="0"/>
+            <w:rPr/>
+          </w:pPr>
+          <w:r>
+            <w:fldChar w:fldCharType="begin"/>
+            <w:instrText xml:space="preserve"> TOC \h \u \z </w:instrText>
+            <w:fldChar w:fldCharType="separate"/>
+          </w:r>
+          <w:hyperlink w:anchor="_heading=h.amid6jgk22ld">
+            <w:r>
+              <w:rPr>
+                <w:b w:val="1"/>
+                <w:rtl w:val="0"/>
+              </w:rPr>
+              <w:t xml:space="preserve">A</w:t>
+            </w:r>
+          </w:hyperlink>
+          <w:r>
+            <w:rPr>
+              <w:b w:val="1"/>
+              <w:rtl w:val="0"/>
+            </w:rPr>
+            <w:tab/>
+          </w:r>
+          <w:r>
+            <w:fldChar w:fldCharType="begin"/>
+            <w:instrText xml:space="preserve"> PAGEREF _heading=h.amid6jgk22ld \h </w:instrText>
+            <w:fldChar w:fldCharType="separate"/>
+          </w:r>
+          <w:r>
+            <w:rPr>
+              <w:b w:val="1"/>
+              <w:rtl w:val="0"/>
+            </w:rPr>
+            <w:t xml:space="preserve">3</w:t>
+          </w:r>
+          <w:r>
+            <w:fldChar w:fldCharType="end"/>
+          </w:r>
+          <w:r>
+            <w:rPr>
+              <w:rtl w:val="0"/>
+            </w:rPr>
+          </w:r>
+        </w:p>
+        <w:p>
+          <w:pPr>
+            <w:tabs>
+              <w:tab w:val="right" w:pos="9025.511811023624"/>
+            </w:tabs>
+            <w:spacing w:before="200" w:line="240" w:lineRule="auto"/>
+            <w:ind w:left="0" w:firstLine="0"/>
+            <w:rPr/>
+          </w:pPr>
+          <w:hyperlink w:anchor="_heading=h.c3od15n9i0f5">
+            <w:r>
+              <w:rPr>
+                <w:b w:val="1"/>
+                <w:rtl w:val="0"/>
+              </w:rPr>
+              <w:t xml:space="preserve">B</w:t>
+            </w:r>
+          </w:hyperlink>
+          <w:r>
+            <w:rPr>
+              <w:b w:val="1"/>
+              <w:rtl w:val="0"/>
+            </w:rPr>
+            <w:tab/>
+          </w:r>
+          <w:r>
+            <w:fldChar w:fldCharType="begin"/>
+            <w:instrText xml:space="preserve"> PAGEREF _heading=h.c3od15n9i0f5 \h </w:instrText>
+            <w:fldChar w:fldCharType="separate"/>
+          </w:r>
+          <w:r>
+            <w:rPr>
+              <w:b w:val="1"/>
+              <w:rtl w:val="0"/>
+            </w:rPr>
+            <w:t xml:space="preserve">3</w:t>
+          </w:r>
+          <w:r>
+            <w:fldChar w:fldCharType="end"/>
+          </w:r>
+          <w:r>
+            <w:rPr>
+              <w:rtl w:val="0"/>
+            </w:rPr>
+          </w:r>
+        </w:p>
+        <w:p>
+          <w:pPr>
+            <w:tabs>
+              <w:tab w:val="right" w:pos="9025.511811023624"/>
+            </w:tabs>
+            <w:spacing w:before="200" w:line="240" w:lineRule="auto"/>
+            <w:ind w:left="0" w:firstLine="0"/>
+            <w:rPr/>
+          </w:pPr>
+          <w:hyperlink w:anchor="_heading=h.vjkvl6gixeny">
+            <w:r>
+              <w:rPr>
+                <w:b w:val="1"/>
+                <w:rtl w:val="0"/>
+              </w:rPr>
+              <w:t xml:space="preserve">C</w:t>
+            </w:r>
+          </w:hyperlink>
+          <w:r>
+            <w:rPr>
+              <w:b w:val="1"/>
+              <w:rtl w:val="0"/>
+            </w:rPr>
+            <w:tab/>
+          </w:r>
+          <w:r>
+            <w:fldChar w:fldCharType="begin"/>
+            <w:instrText xml:space="preserve"> PAGEREF _heading=h.vjkvl6gixeny \h </w:instrText>
+            <w:fldChar w:fldCharType="separate"/>
+          </w:r>
+          <w:r>
+            <w:rPr>
+              <w:b w:val="1"/>
+              <w:rtl w:val="0"/>
+            </w:rPr>
+            <w:t xml:space="preserve">4</w:t>
+          </w:r>
+          <w:r>
+            <w:fldChar w:fldCharType="end"/>
+          </w:r>
+          <w:r>
+            <w:rPr>
+              <w:rtl w:val="0"/>
+            </w:rPr>
+          </w:r>
+        </w:p>
+        <w:p>
+          <w:pPr>
+            <w:tabs>
+              <w:tab w:val="right" w:pos="9025.511811023624"/>
+            </w:tabs>
+            <w:spacing w:before="200" w:line="240" w:lineRule="auto"/>
+            <w:ind w:left="0" w:firstLine="0"/>
+            <w:rPr/>
+          </w:pPr>
+          <w:hyperlink w:anchor="_heading=h.z6phbndd0ot7">
+            <w:r>
+              <w:rPr>
+                <w:b w:val="1"/>
+                <w:rtl w:val="0"/>
+              </w:rPr>
+              <w:t xml:space="preserve">D</w:t>
+            </w:r>
+          </w:hyperlink>
+          <w:r>
+            <w:rPr>
+              <w:b w:val="1"/>
+              <w:rtl w:val="0"/>
+            </w:rPr>
+            <w:tab/>
+          </w:r>
+          <w:r>
+            <w:fldChar w:fldCharType="begin"/>
+            <w:instrText xml:space="preserve"> PAGEREF _heading=h.z6phbndd0ot7 \h </w:instrText>
+            <w:fldChar w:fldCharType="separate"/>
+          </w:r>
+          <w:r>
+            <w:rPr>
+              <w:b w:val="1"/>
+              <w:rtl w:val="0"/>
+            </w:rPr>
+            <w:t xml:space="preserve">5</w:t>
+          </w:r>
+          <w:r>
+            <w:fldChar w:fldCharType="end"/>
+          </w:r>
+          <w:r>
+            <w:rPr>
+              <w:rtl w:val="0"/>
+            </w:rPr>
+          </w:r>
+        </w:p>
+        <w:p>
+          <w:pPr>
+            <w:tabs>
+              <w:tab w:val="right" w:pos="9025.511811023624"/>
+            </w:tabs>
+            <w:spacing w:before="200" w:line="240" w:lineRule="auto"/>
+            <w:ind w:left="0" w:firstLine="0"/>
+            <w:rPr/>
+          </w:pPr>
+          <w:hyperlink w:anchor="_heading=h.ljbk3hcajast">
+            <w:r>
+              <w:rPr>
+                <w:b w:val="1"/>
+                <w:rtl w:val="0"/>
+              </w:rPr>
+              <w:t xml:space="preserve">E</w:t>
+            </w:r>
+          </w:hyperlink>
+          <w:r>
+            <w:rPr>
+              <w:b w:val="1"/>
+              <w:rtl w:val="0"/>
+            </w:rPr>
+            <w:tab/>
+          </w:r>
+          <w:r>
+            <w:fldChar w:fldCharType="begin"/>
+            <w:instrText xml:space="preserve"> PAGEREF _heading=h.ljbk3hcajast \h </w:instrText>
+            <w:fldChar w:fldCharType="separate"/>
+          </w:r>
+          <w:r>
+            <w:rPr>
+              <w:b w:val="1"/>
+              <w:rtl w:val="0"/>
+            </w:rPr>
+            <w:t xml:space="preserve">5</w:t>
+          </w:r>
+          <w:r>
+            <w:fldChar w:fldCharType="end"/>
+          </w:r>
+          <w:r>
+            <w:rPr>
+              <w:rtl w:val="0"/>
+            </w:rPr>
+          </w:r>
+        </w:p>
+        <w:p>
+          <w:pPr>
+            <w:tabs>
+              <w:tab w:val="right" w:pos="9025.511811023624"/>
+            </w:tabs>
+            <w:spacing w:before="200" w:line="240" w:lineRule="auto"/>
+            <w:ind w:left="0" w:firstLine="0"/>
+            <w:rPr/>
+          </w:pPr>
+          <w:hyperlink w:anchor="_heading=h.3uzvbgtcwrnc">
+            <w:r>
+              <w:rPr>
+                <w:b w:val="1"/>
+                <w:rtl w:val="0"/>
+              </w:rPr>
+              <w:t xml:space="preserve">F</w:t>
+            </w:r>
+          </w:hyperlink>
+          <w:r>
+            <w:rPr>
+              <w:b w:val="1"/>
+              <w:rtl w:val="0"/>
+            </w:rPr>
+            <w:tab/>
+          </w:r>
+          <w:r>
+            <w:fldChar w:fldCharType="begin"/>
+            <w:instrText xml:space="preserve"> PAGEREF _heading=h.3uzvbgtcwrnc \h </w:instrText>
+            <w:fldChar w:fldCharType="separate"/>
+          </w:r>
+          <w:r>
+            <w:rPr>
+              <w:b w:val="1"/>
+              <w:rtl w:val="0"/>
+            </w:rPr>
+            <w:t xml:space="preserve">5</w:t>
+          </w:r>
+          <w:r>
+            <w:fldChar w:fldCharType="end"/>
+          </w:r>
+          <w:r>
+            <w:rPr>
+              <w:rtl w:val="0"/>
+            </w:rPr>
+          </w:r>
+        </w:p>
+        <w:p>
+          <w:pPr>
+            <w:tabs>
+              <w:tab w:val="right" w:pos="9025.511811023624"/>
+            </w:tabs>
+            <w:spacing w:before="200" w:line="240" w:lineRule="auto"/>
+            <w:ind w:left="0" w:firstLine="0"/>
+            <w:rPr/>
+          </w:pPr>
+          <w:hyperlink w:anchor="_heading=h.q759okfg4aw9">
+            <w:r>
+              <w:rPr>
+                <w:b w:val="1"/>
+                <w:rtl w:val="0"/>
+              </w:rPr>
+              <w:t xml:space="preserve">G</w:t>
+            </w:r>
+          </w:hyperlink>
+          <w:r>
+            <w:rPr>
+              <w:b w:val="1"/>
+              <w:rtl w:val="0"/>
+            </w:rPr>
+            <w:tab/>
+          </w:r>
+          <w:r>
+            <w:fldChar w:fldCharType="begin"/>
+            <w:instrText xml:space="preserve"> PAGEREF _heading=h.q759okfg4aw9 \h </w:instrText>
+            <w:fldChar w:fldCharType="separate"/>
+          </w:r>
+          <w:r>
+            <w:rPr>
+              <w:b w:val="1"/>
+              <w:rtl w:val="0"/>
+            </w:rPr>
+            <w:t xml:space="preserve">5</w:t>
+          </w:r>
+          <w:r>
+            <w:fldChar w:fldCharType="end"/>
+          </w:r>
+          <w:r>
+            <w:rPr>
+              <w:rtl w:val="0"/>
+            </w:rPr>
+          </w:r>
+        </w:p>
+        <w:p>
+          <w:pPr>
+            <w:tabs>
+              <w:tab w:val="right" w:pos="9025.511811023624"/>
+            </w:tabs>
+            <w:spacing w:before="200" w:line="240" w:lineRule="auto"/>
+            <w:ind w:left="0" w:firstLine="0"/>
+            <w:rPr/>
+          </w:pPr>
+          <w:hyperlink w:anchor="_heading=h.2j5g9r7wstpz">
+            <w:r>
+              <w:rPr>
+                <w:b w:val="1"/>
+                <w:rtl w:val="0"/>
+              </w:rPr>
+              <w:t xml:space="preserve">H</w:t>
+            </w:r>
+          </w:hyperlink>
+          <w:r>
+            <w:rPr>
+              <w:b w:val="1"/>
+              <w:rtl w:val="0"/>
+            </w:rPr>
+            <w:tab/>
+          </w:r>
+          <w:r>
+            <w:fldChar w:fldCharType="begin"/>
+            <w:instrText xml:space="preserve"> PAGEREF _heading=h.2j5g9r7wstpz \h </w:instrText>
+            <w:fldChar w:fldCharType="separate"/>
+          </w:r>
+          <w:r>
+            <w:rPr>
+              <w:b w:val="1"/>
+              <w:rtl w:val="0"/>
+            </w:rPr>
+            <w:t xml:space="preserve">6</w:t>
+          </w:r>
+          <w:r>
+            <w:fldChar w:fldCharType="end"/>
+          </w:r>
+          <w:r>
+            <w:rPr>
+              <w:rtl w:val="0"/>
+            </w:rPr>
+          </w:r>
+        </w:p>
+        <w:p>
+          <w:pPr>
+            <w:tabs>
+              <w:tab w:val="right" w:pos="9025.511811023624"/>
+            </w:tabs>
+            <w:spacing w:before="200" w:line="240" w:lineRule="auto"/>
+            <w:ind w:left="0" w:firstLine="0"/>
+            <w:rPr/>
+          </w:pPr>
+          <w:hyperlink w:anchor="_heading=h.xrjtwvrdeauv">
+            <w:r>
+              <w:rPr>
+                <w:b w:val="1"/>
+                <w:rtl w:val="0"/>
+              </w:rPr>
+              <w:t xml:space="preserve">I</w:t>
+            </w:r>
+          </w:hyperlink>
+          <w:r>
+            <w:rPr>
+              <w:b w:val="1"/>
+              <w:rtl w:val="0"/>
+            </w:rPr>
+            <w:tab/>
+          </w:r>
+          <w:r>
+            <w:fldChar w:fldCharType="begin"/>
+            <w:instrText xml:space="preserve"> PAGEREF _heading=h.xrjtwvrdeauv \h </w:instrText>
+            <w:fldChar w:fldCharType="separate"/>
+          </w:r>
+          <w:r>
+            <w:rPr>
+              <w:b w:val="1"/>
+              <w:rtl w:val="0"/>
+            </w:rPr>
+            <w:t xml:space="preserve">6</w:t>
+          </w:r>
+          <w:r>
+            <w:fldChar w:fldCharType="end"/>
+          </w:r>
+          <w:r>
+            <w:rPr>
+              <w:rtl w:val="0"/>
+            </w:rPr>
+          </w:r>
+        </w:p>
+        <w:p>
+          <w:pPr>
+            <w:tabs>
+              <w:tab w:val="right" w:pos="9025.511811023624"/>
+            </w:tabs>
+            <w:spacing w:before="200" w:line="240" w:lineRule="auto"/>
+            <w:ind w:left="0" w:firstLine="0"/>
+            <w:rPr/>
+          </w:pPr>
+          <w:hyperlink w:anchor="_heading=h.573b5or53hoq">
+            <w:r>
+              <w:rPr>
+                <w:b w:val="1"/>
+                <w:rtl w:val="0"/>
+              </w:rPr>
+              <w:t xml:space="preserve">J</w:t>
+            </w:r>
+          </w:hyperlink>
+          <w:r>
+            <w:rPr>
+              <w:b w:val="1"/>
+              <w:rtl w:val="0"/>
+            </w:rPr>
+            <w:tab/>
+          </w:r>
+          <w:r>
+            <w:fldChar w:fldCharType="begin"/>
+            <w:instrText xml:space="preserve"> PAGEREF _heading=h.573b5or53hoq \h </w:instrText>
+            <w:fldChar w:fldCharType="separate"/>
+          </w:r>
+          <w:r>
+            <w:rPr>
+              <w:b w:val="1"/>
+              <w:rtl w:val="0"/>
+            </w:rPr>
+            <w:t xml:space="preserve">6</w:t>
+          </w:r>
+          <w:r>
+            <w:fldChar w:fldCharType="end"/>
+          </w:r>
+          <w:r>
+            <w:rPr>
+              <w:rtl w:val="0"/>
+            </w:rPr>
+          </w:r>
+        </w:p>
+        <w:p>
+          <w:pPr>
+            <w:tabs>
+              <w:tab w:val="right" w:pos="9025.511811023624"/>
+            </w:tabs>
+            <w:spacing w:before="200" w:line="240" w:lineRule="auto"/>
+            <w:ind w:left="0" w:firstLine="0"/>
+            <w:rPr/>
+          </w:pPr>
+          <w:hyperlink w:anchor="_heading=h.26eenggkiure">
+            <w:r>
+              <w:rPr>
+                <w:b w:val="1"/>
+                <w:rtl w:val="0"/>
+              </w:rPr>
+              <w:t xml:space="preserve">K</w:t>
+            </w:r>
+          </w:hyperlink>
+          <w:r>
+            <w:rPr>
+              <w:b w:val="1"/>
+              <w:rtl w:val="0"/>
+            </w:rPr>
+            <w:tab/>
+          </w:r>
+          <w:r>
+            <w:fldChar w:fldCharType="begin"/>
+            <w:instrText xml:space="preserve"> PAGEREF _heading=h.26eenggkiure \h </w:instrText>
+            <w:fldChar w:fldCharType="separate"/>
+          </w:r>
+          <w:r>
+            <w:rPr>
+              <w:b w:val="1"/>
+              <w:rtl w:val="0"/>
+            </w:rPr>
+            <w:t xml:space="preserve">7</w:t>
+          </w:r>
+          <w:r>
+            <w:fldChar w:fldCharType="end"/>
+          </w:r>
+          <w:r>
+            <w:rPr>
+              <w:rtl w:val="0"/>
+            </w:rPr>
+          </w:r>
+        </w:p>
+        <w:p>
+          <w:pPr>
+            <w:tabs>
+              <w:tab w:val="right" w:pos="9025.511811023624"/>
+            </w:tabs>
+            <w:spacing w:before="200" w:line="240" w:lineRule="auto"/>
+            <w:ind w:left="0" w:firstLine="0"/>
+            <w:rPr/>
+          </w:pPr>
+          <w:hyperlink w:anchor="_heading=h.dqdyltk3noil">
+            <w:r>
+              <w:rPr>
+                <w:b w:val="1"/>
+                <w:rtl w:val="0"/>
+              </w:rPr>
+              <w:t xml:space="preserve">L</w:t>
+            </w:r>
+          </w:hyperlink>
+          <w:r>
+            <w:rPr>
+              <w:b w:val="1"/>
+              <w:rtl w:val="0"/>
+            </w:rPr>
+            <w:tab/>
+          </w:r>
+          <w:r>
+            <w:fldChar w:fldCharType="begin"/>
+            <w:instrText xml:space="preserve"> PAGEREF _heading=h.dqdyltk3noil \h </w:instrText>
+            <w:fldChar w:fldCharType="separate"/>
+          </w:r>
+          <w:r>
+            <w:rPr>
+              <w:b w:val="1"/>
+              <w:rtl w:val="0"/>
+            </w:rPr>
+            <w:t xml:space="preserve">7</w:t>
+          </w:r>
+          <w:r>
+            <w:fldChar w:fldCharType="end"/>
+          </w:r>
+          <w:r>
+            <w:rPr>
+              <w:rtl w:val="0"/>
+            </w:rPr>
+          </w:r>
+        </w:p>
+        <w:p>
+          <w:pPr>
+            <w:tabs>
+              <w:tab w:val="right" w:pos="9025.511811023624"/>
+            </w:tabs>
+            <w:spacing w:before="200" w:line="240" w:lineRule="auto"/>
+            <w:ind w:left="0" w:firstLine="0"/>
+            <w:rPr/>
+          </w:pPr>
+          <w:hyperlink w:anchor="_heading=h.qvnplk78jupp">
+            <w:r>
+              <w:rPr>
+                <w:b w:val="1"/>
+                <w:rtl w:val="0"/>
+              </w:rPr>
+              <w:t xml:space="preserve">M</w:t>
+            </w:r>
+          </w:hyperlink>
+          <w:r>
+            <w:rPr>
+              <w:b w:val="1"/>
+              <w:rtl w:val="0"/>
+            </w:rPr>
+            <w:tab/>
+          </w:r>
+          <w:r>
+            <w:fldChar w:fldCharType="begin"/>
+            <w:instrText xml:space="preserve"> PAGEREF _heading=h.qvnplk78jupp \h </w:instrText>
+            <w:fldChar w:fldCharType="separate"/>
+          </w:r>
+          <w:r>
+            <w:rPr>
+              <w:b w:val="1"/>
+              <w:rtl w:val="0"/>
+            </w:rPr>
+            <w:t xml:space="preserve">7</w:t>
+          </w:r>
+          <w:r>
+            <w:fldChar w:fldCharType="end"/>
+          </w:r>
+          <w:r>
+            <w:rPr>
+              <w:rtl w:val="0"/>
+            </w:rPr>
+          </w:r>
+        </w:p>
+        <w:p>
+          <w:pPr>
+            <w:tabs>
+              <w:tab w:val="right" w:pos="9025.511811023624"/>
+            </w:tabs>
+            <w:spacing w:before="200" w:line="240" w:lineRule="auto"/>
+            <w:ind w:left="0" w:firstLine="0"/>
+            <w:rPr/>
+          </w:pPr>
+          <w:hyperlink w:anchor="_heading=h.tghf84p1fmv">
+            <w:r>
+              <w:rPr>
+                <w:b w:val="1"/>
+                <w:rtl w:val="0"/>
+              </w:rPr>
+              <w:t xml:space="preserve">N</w:t>
+            </w:r>
+          </w:hyperlink>
+          <w:r>
+            <w:rPr>
+              <w:b w:val="1"/>
+              <w:rtl w:val="0"/>
+            </w:rPr>
+            <w:tab/>
+          </w:r>
+          <w:r>
+            <w:fldChar w:fldCharType="begin"/>
+            <w:instrText xml:space="preserve"> PAGEREF _heading=h.tghf84p1fmv \h </w:instrText>
+            <w:fldChar w:fldCharType="separate"/>
+          </w:r>
+          <w:r>
+            <w:rPr>
+              <w:b w:val="1"/>
+              <w:rtl w:val="0"/>
+            </w:rPr>
+            <w:t xml:space="preserve">8</w:t>
+          </w:r>
+          <w:r>
+            <w:fldChar w:fldCharType="end"/>
+          </w:r>
+          <w:r>
+            <w:rPr>
+              <w:rtl w:val="0"/>
+            </w:rPr>
+          </w:r>
+        </w:p>
+        <w:p>
+          <w:pPr>
+            <w:tabs>
+              <w:tab w:val="right" w:pos="9025.511811023624"/>
+            </w:tabs>
+            <w:spacing w:before="200" w:line="240" w:lineRule="auto"/>
+            <w:ind w:left="0" w:firstLine="0"/>
+            <w:rPr/>
+          </w:pPr>
+          <w:hyperlink w:anchor="_heading=h.rywap1dyhx3h">
+            <w:r>
+              <w:rPr>
+                <w:b w:val="1"/>
+                <w:rtl w:val="0"/>
+              </w:rPr>
+              <w:t xml:space="preserve">O</w:t>
+            </w:r>
+          </w:hyperlink>
+          <w:r>
+            <w:rPr>
+              <w:b w:val="1"/>
+              <w:rtl w:val="0"/>
+            </w:rPr>
+            <w:tab/>
+          </w:r>
+          <w:r>
+            <w:fldChar w:fldCharType="begin"/>
+            <w:instrText xml:space="preserve"> PAGEREF _heading=h.rywap1dyhx3h \h </w:instrText>
+            <w:fldChar w:fldCharType="separate"/>
+          </w:r>
+          <w:r>
+            <w:rPr>
+              <w:b w:val="1"/>
+              <w:rtl w:val="0"/>
+            </w:rPr>
+            <w:t xml:space="preserve">8</w:t>
+          </w:r>
+          <w:r>
+            <w:fldChar w:fldCharType="end"/>
+          </w:r>
+          <w:r>
+            <w:rPr>
+              <w:rtl w:val="0"/>
+            </w:rPr>
+          </w:r>
+        </w:p>
+        <w:p>
+          <w:pPr>
+            <w:tabs>
+              <w:tab w:val="right" w:pos="9025.511811023624"/>
+            </w:tabs>
+            <w:spacing w:before="200" w:line="240" w:lineRule="auto"/>
+            <w:ind w:left="0" w:firstLine="0"/>
+            <w:rPr/>
+          </w:pPr>
+          <w:hyperlink w:anchor="_heading=h.cfep3z3ap20y">
+            <w:r>
+              <w:rPr>
+                <w:b w:val="1"/>
+                <w:rtl w:val="0"/>
+              </w:rPr>
+              <w:t xml:space="preserve">P</w:t>
+            </w:r>
+          </w:hyperlink>
+          <w:r>
+            <w:rPr>
+              <w:b w:val="1"/>
+              <w:rtl w:val="0"/>
+            </w:rPr>
+            <w:tab/>
+          </w:r>
+          <w:r>
+            <w:fldChar w:fldCharType="begin"/>
+            <w:instrText xml:space="preserve"> PAGEREF _heading=h.cfep3z3ap20y \h </w:instrText>
+            <w:fldChar w:fldCharType="separate"/>
+          </w:r>
+          <w:r>
+            <w:rPr>
+              <w:b w:val="1"/>
+              <w:rtl w:val="0"/>
+            </w:rPr>
+            <w:t xml:space="preserve">8</w:t>
+          </w:r>
+          <w:r>
+            <w:fldChar w:fldCharType="end"/>
+          </w:r>
+          <w:r>
+            <w:rPr>
+              <w:rtl w:val="0"/>
+            </w:rPr>
+          </w:r>
+        </w:p>
+        <w:p>
+          <w:pPr>
+            <w:tabs>
+              <w:tab w:val="right" w:pos="9025.511811023624"/>
+            </w:tabs>
+            <w:spacing w:before="200" w:line="240" w:lineRule="auto"/>
+            <w:ind w:left="0" w:firstLine="0"/>
+            <w:rPr/>
+          </w:pPr>
+          <w:hyperlink w:anchor="_heading=h.94ef2uw5eevc">
+            <w:r>
+              <w:rPr>
+                <w:b w:val="1"/>
+                <w:rtl w:val="0"/>
+              </w:rPr>
+              <w:t xml:space="preserve">Q</w:t>
+            </w:r>
+          </w:hyperlink>
+          <w:r>
+            <w:rPr>
+              <w:b w:val="1"/>
+              <w:rtl w:val="0"/>
+            </w:rPr>
+            <w:tab/>
+          </w:r>
+          <w:r>
+            <w:fldChar w:fldCharType="begin"/>
+            <w:instrText xml:space="preserve"> PAGEREF _heading=h.94ef2uw5eevc \h </w:instrText>
+            <w:fldChar w:fldCharType="separate"/>
+          </w:r>
+          <w:r>
+            <w:rPr>
+              <w:b w:val="1"/>
+              <w:rtl w:val="0"/>
+            </w:rPr>
+            <w:t xml:space="preserve">8</w:t>
+          </w:r>
+          <w:r>
+            <w:fldChar w:fldCharType="end"/>
+          </w:r>
+          <w:r>
+            <w:rPr>
+              <w:rtl w:val="0"/>
+            </w:rPr>
+          </w:r>
+        </w:p>
+        <w:p>
+          <w:pPr>
+            <w:tabs>
+              <w:tab w:val="right" w:pos="9025.511811023624"/>
+            </w:tabs>
+            <w:spacing w:before="200" w:line="240" w:lineRule="auto"/>
+            <w:ind w:left="0" w:firstLine="0"/>
+            <w:rPr/>
+          </w:pPr>
+          <w:hyperlink w:anchor="_heading=h.q7r8nrpvnmia">
+            <w:r>
+              <w:rPr>
+                <w:b w:val="1"/>
+                <w:rtl w:val="0"/>
+              </w:rPr>
+              <w:t xml:space="preserve">R</w:t>
+            </w:r>
+          </w:hyperlink>
+          <w:r>
+            <w:rPr>
+              <w:b w:val="1"/>
+              <w:rtl w:val="0"/>
+            </w:rPr>
+            <w:tab/>
+          </w:r>
+          <w:r>
+            <w:fldChar w:fldCharType="begin"/>
+            <w:instrText xml:space="preserve"> PAGEREF _heading=h.q7r8nrpvnmia \h </w:instrText>
+            <w:fldChar w:fldCharType="separate"/>
+          </w:r>
+          <w:r>
+            <w:rPr>
+              <w:b w:val="1"/>
+              <w:rtl w:val="0"/>
+            </w:rPr>
+            <w:t xml:space="preserve">9</w:t>
+          </w:r>
+          <w:r>
+            <w:fldChar w:fldCharType="end"/>
+          </w:r>
+          <w:r>
+            <w:rPr>
+              <w:rtl w:val="0"/>
+            </w:rPr>
+          </w:r>
+        </w:p>
+        <w:p>
+          <w:pPr>
+            <w:tabs>
+              <w:tab w:val="right" w:pos="9025.511811023624"/>
+            </w:tabs>
+            <w:spacing w:before="200" w:line="240" w:lineRule="auto"/>
+            <w:ind w:left="0" w:firstLine="0"/>
+            <w:rPr/>
+          </w:pPr>
+          <w:hyperlink w:anchor="_heading=h.xhdg4po99hpl">
+            <w:r>
+              <w:rPr>
+                <w:b w:val="1"/>
+                <w:rtl w:val="0"/>
+              </w:rPr>
+              <w:t xml:space="preserve">S</w:t>
+            </w:r>
+          </w:hyperlink>
+          <w:r>
+            <w:rPr>
+              <w:b w:val="1"/>
+              <w:rtl w:val="0"/>
+            </w:rPr>
+            <w:tab/>
+          </w:r>
+          <w:r>
+            <w:fldChar w:fldCharType="begin"/>
+            <w:instrText xml:space="preserve"> PAGEREF _heading=h.xhdg4po99hpl \h </w:instrText>
+            <w:fldChar w:fldCharType="separate"/>
+          </w:r>
+          <w:r>
+            <w:rPr>
+              <w:b w:val="1"/>
+              <w:rtl w:val="0"/>
+            </w:rPr>
+            <w:t xml:space="preserve">9</w:t>
+          </w:r>
+          <w:r>
+            <w:fldChar w:fldCharType="end"/>
+          </w:r>
+          <w:r>
+            <w:rPr>
+              <w:rtl w:val="0"/>
+            </w:rPr>
+          </w:r>
+        </w:p>
+        <w:p>
+          <w:pPr>
+            <w:tabs>
+              <w:tab w:val="right" w:pos="9025.511811023624"/>
+            </w:tabs>
+            <w:spacing w:before="200" w:line="240" w:lineRule="auto"/>
+            <w:ind w:left="0" w:firstLine="0"/>
+            <w:rPr/>
+          </w:pPr>
+          <w:hyperlink w:anchor="_heading=h.vfz5o2qh4b85">
+            <w:r>
+              <w:rPr>
+                <w:b w:val="1"/>
+                <w:rtl w:val="0"/>
+              </w:rPr>
+              <w:t xml:space="preserve">T</w:t>
+            </w:r>
+          </w:hyperlink>
+          <w:r>
+            <w:rPr>
+              <w:b w:val="1"/>
+              <w:rtl w:val="0"/>
+            </w:rPr>
+            <w:tab/>
+          </w:r>
+          <w:r>
+            <w:fldChar w:fldCharType="begin"/>
+            <w:instrText xml:space="preserve"> PAGEREF _heading=h.vfz5o2qh4b85 \h </w:instrText>
+            <w:fldChar w:fldCharType="separate"/>
+          </w:r>
+          <w:r>
+            <w:rPr>
+              <w:b w:val="1"/>
+              <w:rtl w:val="0"/>
+            </w:rPr>
+            <w:t xml:space="preserve">10</w:t>
+          </w:r>
+          <w:r>
+            <w:fldChar w:fldCharType="end"/>
+          </w:r>
+          <w:r>
+            <w:rPr>
+              <w:rtl w:val="0"/>
+            </w:rPr>
+          </w:r>
+        </w:p>
+        <w:p>
+          <w:pPr>
+            <w:tabs>
+              <w:tab w:val="right" w:pos="9025.511811023624"/>
+            </w:tabs>
+            <w:spacing w:before="200" w:line="240" w:lineRule="auto"/>
+            <w:ind w:left="0" w:firstLine="0"/>
+            <w:rPr/>
+          </w:pPr>
+          <w:hyperlink w:anchor="_heading=h.j7wx9x8lp11c">
+            <w:r>
+              <w:rPr>
+                <w:b w:val="1"/>
+                <w:rtl w:val="0"/>
+              </w:rPr>
+              <w:t xml:space="preserve">U</w:t>
+            </w:r>
+          </w:hyperlink>
+          <w:r>
+            <w:rPr>
+              <w:b w:val="1"/>
+              <w:rtl w:val="0"/>
+            </w:rPr>
+            <w:tab/>
+          </w:r>
+          <w:r>
+            <w:fldChar w:fldCharType="begin"/>
+            <w:instrText xml:space="preserve"> PAGEREF _heading=h.j7wx9x8lp11c \h </w:instrText>
+            <w:fldChar w:fldCharType="separate"/>
+          </w:r>
+          <w:r>
+            <w:rPr>
+              <w:b w:val="1"/>
+              <w:rtl w:val="0"/>
+            </w:rPr>
+            <w:t xml:space="preserve">11</w:t>
+          </w:r>
+          <w:r>
+            <w:fldChar w:fldCharType="end"/>
+          </w:r>
+          <w:r>
+            <w:rPr>
+              <w:rtl w:val="0"/>
+            </w:rPr>
+          </w:r>
+        </w:p>
+        <w:p>
+          <w:pPr>
+            <w:tabs>
+              <w:tab w:val="right" w:pos="9025.511811023624"/>
+            </w:tabs>
+            <w:spacing w:before="200" w:line="240" w:lineRule="auto"/>
+            <w:ind w:left="0" w:firstLine="0"/>
+            <w:rPr/>
+          </w:pPr>
+          <w:hyperlink w:anchor="_heading=h.z9uf1ek4mlbp">
+            <w:r>
+              <w:rPr>
+                <w:b w:val="1"/>
+                <w:rtl w:val="0"/>
+              </w:rPr>
+              <w:t xml:space="preserve">V</w:t>
+            </w:r>
+          </w:hyperlink>
+          <w:r>
+            <w:rPr>
+              <w:b w:val="1"/>
+              <w:rtl w:val="0"/>
+            </w:rPr>
+            <w:tab/>
+          </w:r>
+          <w:r>
+            <w:fldChar w:fldCharType="begin"/>
+            <w:instrText xml:space="preserve"> PAGEREF _heading=h.z9uf1ek4mlbp \h </w:instrText>
+            <w:fldChar w:fldCharType="separate"/>
+          </w:r>
+          <w:r>
+            <w:rPr>
+              <w:b w:val="1"/>
+              <w:rtl w:val="0"/>
+            </w:rPr>
+            <w:t xml:space="preserve">11</w:t>
+          </w:r>
+          <w:r>
+            <w:fldChar w:fldCharType="end"/>
+          </w:r>
+          <w:r>
+            <w:rPr>
+              <w:rtl w:val="0"/>
+            </w:rPr>
+          </w:r>
+        </w:p>
+        <w:p>
+          <w:pPr>
+            <w:tabs>
+              <w:tab w:val="right" w:pos="9025.511811023624"/>
+            </w:tabs>
+            <w:spacing w:before="200" w:line="240" w:lineRule="auto"/>
+            <w:ind w:left="0" w:firstLine="0"/>
+            <w:rPr/>
+          </w:pPr>
+          <w:hyperlink w:anchor="_heading=h.d7omphel29yk">
+            <w:r>
+              <w:rPr>
+                <w:b w:val="1"/>
+                <w:rtl w:val="0"/>
+              </w:rPr>
+              <w:t xml:space="preserve">W</w:t>
+            </w:r>
+          </w:hyperlink>
+          <w:r>
+            <w:rPr>
+              <w:b w:val="1"/>
+              <w:rtl w:val="0"/>
+            </w:rPr>
+            <w:tab/>
+          </w:r>
+          <w:r>
+            <w:fldChar w:fldCharType="begin"/>
+            <w:instrText xml:space="preserve"> PAGEREF _heading=h.d7omphel29yk \h </w:instrText>
+            <w:fldChar w:fldCharType="separate"/>
+          </w:r>
+          <w:r>
+            <w:rPr>
+              <w:b w:val="1"/>
+              <w:rtl w:val="0"/>
+            </w:rPr>
+            <w:t xml:space="preserve">11</w:t>
+          </w:r>
+          <w:r>
+            <w:fldChar w:fldCharType="end"/>
+          </w:r>
+          <w:r>
+            <w:rPr>
+              <w:rtl w:val="0"/>
+            </w:rPr>
+          </w:r>
+        </w:p>
+        <w:p>
+          <w:pPr>
+            <w:tabs>
+              <w:tab w:val="right" w:pos="9025.511811023624"/>
+            </w:tabs>
+            <w:spacing w:before="200" w:line="240" w:lineRule="auto"/>
+            <w:ind w:left="0" w:firstLine="0"/>
+            <w:rPr/>
+          </w:pPr>
+          <w:hyperlink w:anchor="_heading=h.raz4gnk7qb3c">
+            <w:r>
+              <w:rPr>
+                <w:b w:val="1"/>
+                <w:rtl w:val="0"/>
+              </w:rPr>
+              <w:t xml:space="preserve">X</w:t>
+            </w:r>
+          </w:hyperlink>
+          <w:r>
+            <w:rPr>
+              <w:b w:val="1"/>
+              <w:rtl w:val="0"/>
+            </w:rPr>
+            <w:tab/>
+          </w:r>
+          <w:r>
+            <w:fldChar w:fldCharType="begin"/>
+            <w:instrText xml:space="preserve"> PAGEREF _heading=h.raz4gnk7qb3c \h </w:instrText>
+            <w:fldChar w:fldCharType="separate"/>
+          </w:r>
+          <w:r>
+            <w:rPr>
+              <w:b w:val="1"/>
+              <w:rtl w:val="0"/>
+            </w:rPr>
+            <w:t xml:space="preserve">12</w:t>
+          </w:r>
+          <w:r>
+            <w:fldChar w:fldCharType="end"/>
+          </w:r>
+          <w:r>
+            <w:rPr>
+              <w:rtl w:val="0"/>
+            </w:rPr>
+          </w:r>
+        </w:p>
+        <w:p>
+          <w:pPr>
+            <w:tabs>
+              <w:tab w:val="right" w:pos="9025.511811023624"/>
+            </w:tabs>
+            <w:spacing w:before="200" w:line="240" w:lineRule="auto"/>
+            <w:ind w:left="0" w:firstLine="0"/>
+            <w:rPr/>
+          </w:pPr>
+          <w:hyperlink w:anchor="_heading=h.n5z2xkyvg9ok">
+            <w:r>
+              <w:rPr>
+                <w:b w:val="1"/>
+                <w:rtl w:val="0"/>
+              </w:rPr>
+              <w:t xml:space="preserve">Y</w:t>
+            </w:r>
+          </w:hyperlink>
+          <w:r>
+            <w:rPr>
+              <w:b w:val="1"/>
+              <w:rtl w:val="0"/>
+            </w:rPr>
+            <w:tab/>
+          </w:r>
+          <w:r>
+            <w:fldChar w:fldCharType="begin"/>
+            <w:instrText xml:space="preserve"> PAGEREF _heading=h.n5z2xkyvg9ok \h </w:instrText>
+            <w:fldChar w:fldCharType="separate"/>
+          </w:r>
+          <w:r>
+            <w:rPr>
+              <w:b w:val="1"/>
+              <w:rtl w:val="0"/>
+            </w:rPr>
+            <w:t xml:space="preserve">12</w:t>
+          </w:r>
+          <w:r>
+            <w:fldChar w:fldCharType="end"/>
+          </w:r>
+          <w:r>
+            <w:rPr>
+              <w:rtl w:val="0"/>
+            </w:rPr>
+          </w:r>
+        </w:p>
+        <w:p>
+          <w:pPr>
+            <w:tabs>
+              <w:tab w:val="right" w:pos="9025.511811023624"/>
+            </w:tabs>
+            <w:spacing w:after="80" w:before="200" w:line="240" w:lineRule="auto"/>
+            <w:ind w:left="0" w:firstLine="0"/>
+            <w:rPr/>
+          </w:pPr>
+          <w:hyperlink w:anchor="_heading=h.dmwsict6wzgi">
+            <w:r>
+              <w:rPr>
+                <w:b w:val="1"/>
+                <w:rtl w:val="0"/>
+              </w:rPr>
+              <w:t xml:space="preserve">Z</w:t>
+            </w:r>
+          </w:hyperlink>
+          <w:r>
+            <w:rPr>
+              <w:b w:val="1"/>
+              <w:rtl w:val="0"/>
+            </w:rPr>
+            <w:tab/>
+          </w:r>
+          <w:r>
+            <w:fldChar w:fldCharType="begin"/>
+            <w:instrText xml:space="preserve"> PAGEREF _heading=h.dmwsict6wzgi \h </w:instrText>
+            <w:fldChar w:fldCharType="separate"/>
+          </w:r>
+          <w:r>
+            <w:rPr>
+              <w:b w:val="1"/>
+              <w:rtl w:val="0"/>
+            </w:rPr>
+            <w:t xml:space="preserve">12</w:t>
+          </w:r>
+          <w:r>
+            <w:fldChar w:fldCharType="end"/>
+          </w:r>
+          <w:r>
+            <w:rPr>
+              <w:rtl w:val="0"/>
+            </w:rPr>
+          </w:r>
+          <w:r>
+            <w:fldChar w:fldCharType="end"/>
+          </w:r>
+        </w:p>
+      </w:sdtContent>
+    </w:sdt>
+    <w:p>
+      <w:pPr>
+        <w:rPr>
+          <w:sz w:val="32"/>
+          <w:szCs w:val="32"/>
+        </w:rPr>
+      </w:pPr>
+      <w:r>
+        <w:rPr>
+          <w:rtl w:val="0"/>
+        </w:rPr>
+      </w:r>
+    </w:p>
+    <w:p>
+      <w:pPr>
+        <w:spacing w:line="240" w:lineRule="auto"/>
+        <w:rPr>
+          <w:sz w:val="32"/>
+          <w:szCs w:val="32"/>
+        </w:rPr>
+      </w:pPr>
+      <w:r>
+        <w:br w:type="page"/>
+      </w:r>
+      <w:r>
+        <w:rPr>
+          <w:rtl w:val="0"/>
+        </w:rPr>
+      </w:r>
+    </w:p>
+    <w:p>
+      <w:pPr>
+        <w:spacing w:line="240" w:lineRule="auto"/>
+        <w:rPr>
+          <w:sz w:val="32"/>
+          <w:szCs w:val="32"/>
+        </w:rPr>
+      </w:pPr>
+      <w:r>
+        <w:rPr>
+          <w:sz w:val="32"/>
+          <w:szCs w:val="32"/>
+          <w:rtl w:val="0"/>
+        </w:rPr>
         <w:t xml:space="preserve">1</w:t>
         <w:tab/>
         <w:t xml:space="preserve">Introduzione e struttura</w:t>
@@ -1960,16 +3221,14 @@
     </w:p>
     <w:p>
       <w:pPr>
+        <w:pStyle w:val="Heading1"/>
         <w:spacing w:line="240" w:lineRule="auto"/>
-        <w:rPr>
-          <w:sz w:val="32"/>
-          <w:szCs w:val="32"/>
-        </w:rPr>
-      </w:pPr>
-      <w:r>
-        <w:rPr>
-          <w:sz w:val="32"/>
-          <w:szCs w:val="32"/>
+        <w:rPr/>
+      </w:pPr>
+      <w:bookmarkStart w:colFirst="0" w:colLast="0" w:name="_heading=h.amid6jgk22ld" w:id="1"/>
+      <w:bookmarkEnd w:id="1"/>
+      <w:r>
+        <w:rPr>
           <w:rtl w:val="0"/>
         </w:rPr>
         <w:t xml:space="preserve">A</w:t>
@@ -2141,16 +3400,14 @@
     </w:p>
     <w:p>
       <w:pPr>
+        <w:pStyle w:val="Heading1"/>
         <w:spacing w:line="240" w:lineRule="auto"/>
-        <w:rPr>
-          <w:sz w:val="32"/>
-          <w:szCs w:val="32"/>
-        </w:rPr>
-      </w:pPr>
-      <w:r>
-        <w:rPr>
-          <w:sz w:val="32"/>
-          <w:szCs w:val="32"/>
+        <w:rPr/>
+      </w:pPr>
+      <w:bookmarkStart w:colFirst="0" w:colLast="0" w:name="_heading=h.c3od15n9i0f5" w:id="2"/>
+      <w:bookmarkEnd w:id="2"/>
+      <w:r>
+        <w:rPr>
           <w:rtl w:val="0"/>
         </w:rPr>
         <w:t xml:space="preserve">B</w:t>
@@ -2270,6 +3527,19 @@
     <w:p>
       <w:pPr>
         <w:rPr>
+          <w:sz w:val="28"/>
+          <w:szCs w:val="28"/>
+        </w:rPr>
+      </w:pPr>
+      <w:r>
+        <w:rPr>
+          <w:rtl w:val="0"/>
+        </w:rPr>
+      </w:r>
+    </w:p>
+    <w:p>
+      <w:pPr>
+        <w:rPr>
           <w:sz w:val="20"/>
           <w:szCs w:val="20"/>
         </w:rPr>
@@ -2359,16 +3629,14 @@
     </w:p>
     <w:p>
       <w:pPr>
+        <w:pStyle w:val="Heading1"/>
         <w:spacing w:line="240" w:lineRule="auto"/>
-        <w:rPr>
-          <w:sz w:val="32"/>
-          <w:szCs w:val="32"/>
-        </w:rPr>
-      </w:pPr>
-      <w:r>
-        <w:rPr>
-          <w:sz w:val="32"/>
-          <w:szCs w:val="32"/>
+        <w:rPr/>
+      </w:pPr>
+      <w:bookmarkStart w:colFirst="0" w:colLast="0" w:name="_heading=h.vjkvl6gixeny" w:id="3"/>
+      <w:bookmarkEnd w:id="3"/>
+      <w:r>
+        <w:rPr>
           <w:rtl w:val="0"/>
         </w:rPr>
         <w:t xml:space="preserve">C</w:t>
@@ -2666,8 +3934,34 @@
       </w:pPr>
       <w:r>
         <w:rPr>
+          <w:rtl w:val="0"/>
+        </w:rPr>
+      </w:r>
+    </w:p>
+    <w:p>
+      <w:pPr>
+        <w:spacing w:line="240" w:lineRule="auto"/>
+        <w:rPr>
           <w:sz w:val="32"/>
           <w:szCs w:val="32"/>
+        </w:rPr>
+      </w:pPr>
+      <w:r>
+        <w:rPr>
+          <w:rtl w:val="0"/>
+        </w:rPr>
+      </w:r>
+    </w:p>
+    <w:p>
+      <w:pPr>
+        <w:pStyle w:val="Heading1"/>
+        <w:spacing w:line="240" w:lineRule="auto"/>
+        <w:rPr/>
+      </w:pPr>
+      <w:bookmarkStart w:colFirst="0" w:colLast="0" w:name="_heading=h.z6phbndd0ot7" w:id="4"/>
+      <w:bookmarkEnd w:id="4"/>
+      <w:r>
+        <w:rPr>
           <w:rtl w:val="0"/>
         </w:rPr>
         <w:t xml:space="preserve">D</w:t>
@@ -2715,33 +4009,14 @@
     </w:p>
     <w:p>
       <w:pPr>
+        <w:pStyle w:val="Heading1"/>
         <w:spacing w:line="240" w:lineRule="auto"/>
-        <w:rPr>
-          <w:sz w:val="32"/>
-          <w:szCs w:val="32"/>
-        </w:rPr>
-      </w:pPr>
-      <w:r>
-        <w:br w:type="page"/>
-      </w:r>
-      <w:r>
-        <w:rPr>
-          <w:rtl w:val="0"/>
-        </w:rPr>
-      </w:r>
-    </w:p>
-    <w:p>
-      <w:pPr>
-        <w:spacing w:line="240" w:lineRule="auto"/>
-        <w:rPr>
-          <w:sz w:val="32"/>
-          <w:szCs w:val="32"/>
-        </w:rPr>
-      </w:pPr>
-      <w:r>
-        <w:rPr>
-          <w:sz w:val="32"/>
-          <w:szCs w:val="32"/>
+        <w:rPr/>
+      </w:pPr>
+      <w:bookmarkStart w:colFirst="0" w:colLast="0" w:name="_heading=h.ljbk3hcajast" w:id="5"/>
+      <w:bookmarkEnd w:id="5"/>
+      <w:r>
+        <w:rPr>
           <w:rtl w:val="0"/>
         </w:rPr>
         <w:t xml:space="preserve">E</w:t>
@@ -2829,16 +4104,14 @@
     </w:p>
     <w:p>
       <w:pPr>
+        <w:pStyle w:val="Heading1"/>
         <w:spacing w:line="240" w:lineRule="auto"/>
-        <w:rPr>
-          <w:sz w:val="32"/>
-          <w:szCs w:val="32"/>
-        </w:rPr>
-      </w:pPr>
-      <w:r>
-        <w:rPr>
-          <w:sz w:val="32"/>
-          <w:szCs w:val="32"/>
+        <w:rPr/>
+      </w:pPr>
+      <w:bookmarkStart w:colFirst="0" w:colLast="0" w:name="_heading=h.3uzvbgtcwrnc" w:id="6"/>
+      <w:bookmarkEnd w:id="6"/>
+      <w:r>
+        <w:rPr>
           <w:rtl w:val="0"/>
         </w:rPr>
         <w:t xml:space="preserve">F</w:t>
@@ -2886,16 +4159,14 @@
     </w:p>
     <w:p>
       <w:pPr>
+        <w:pStyle w:val="Heading1"/>
         <w:spacing w:line="240" w:lineRule="auto"/>
-        <w:rPr>
-          <w:sz w:val="32"/>
-          <w:szCs w:val="32"/>
-        </w:rPr>
-      </w:pPr>
-      <w:r>
-        <w:rPr>
-          <w:sz w:val="32"/>
-          <w:szCs w:val="32"/>
+        <w:rPr/>
+      </w:pPr>
+      <w:bookmarkStart w:colFirst="0" w:colLast="0" w:name="_heading=h.q759okfg4aw9" w:id="7"/>
+      <w:bookmarkEnd w:id="7"/>
+      <w:r>
+        <w:rPr>
           <w:rtl w:val="0"/>
         </w:rPr>
         <w:t xml:space="preserve">G</w:t>
@@ -3073,16 +4344,14 @@
     </w:p>
     <w:p>
       <w:pPr>
+        <w:pStyle w:val="Heading1"/>
         <w:spacing w:line="240" w:lineRule="auto"/>
-        <w:rPr>
-          <w:sz w:val="32"/>
-          <w:szCs w:val="32"/>
-        </w:rPr>
-      </w:pPr>
-      <w:r>
-        <w:rPr>
-          <w:sz w:val="32"/>
-          <w:szCs w:val="32"/>
+        <w:rPr/>
+      </w:pPr>
+      <w:bookmarkStart w:colFirst="0" w:colLast="0" w:name="_heading=h.2j5g9r7wstpz" w:id="8"/>
+      <w:bookmarkEnd w:id="8"/>
+      <w:r>
+        <w:rPr>
           <w:rtl w:val="0"/>
         </w:rPr>
         <w:t xml:space="preserve">H</w:t>
@@ -3090,16 +4359,14 @@
     </w:p>
     <w:p>
       <w:pPr>
+        <w:pStyle w:val="Heading1"/>
         <w:spacing w:line="240" w:lineRule="auto"/>
-        <w:rPr>
-          <w:sz w:val="32"/>
-          <w:szCs w:val="32"/>
-        </w:rPr>
-      </w:pPr>
-      <w:r>
-        <w:rPr>
-          <w:sz w:val="32"/>
-          <w:szCs w:val="32"/>
+        <w:rPr/>
+      </w:pPr>
+      <w:bookmarkStart w:colFirst="0" w:colLast="0" w:name="_heading=h.xrjtwvrdeauv" w:id="9"/>
+      <w:bookmarkEnd w:id="9"/>
+      <w:r>
+        <w:rPr>
           <w:rtl w:val="0"/>
         </w:rPr>
         <w:t xml:space="preserve">I</w:t>
@@ -3187,19 +4454,6 @@
         </w:rPr>
         <w:t xml:space="preserve"> sul sistema operativo Mac OS X per computer desktop e portatili. Il kit per sviluppatori iOS fornisce strumenti che consentono lo sviluppo di app per iOS.</w:t>
       </w:r>
-      <w:r>
-        <w:rPr>
-          <w:rtl w:val="0"/>
-        </w:rPr>
-      </w:r>
-    </w:p>
-    <w:p>
-      <w:pPr>
-        <w:rPr>
-          <w:sz w:val="28"/>
-          <w:szCs w:val="28"/>
-        </w:rPr>
-      </w:pPr>
       <w:r>
         <w:rPr>
           <w:rtl w:val="0"/>
@@ -3320,16 +4574,14 @@
     </w:p>
     <w:p>
       <w:pPr>
+        <w:pStyle w:val="Heading1"/>
         <w:spacing w:line="240" w:lineRule="auto"/>
-        <w:rPr>
-          <w:sz w:val="32"/>
-          <w:szCs w:val="32"/>
-        </w:rPr>
-      </w:pPr>
-      <w:r>
-        <w:rPr>
-          <w:sz w:val="32"/>
-          <w:szCs w:val="32"/>
+        <w:rPr/>
+      </w:pPr>
+      <w:bookmarkStart w:colFirst="0" w:colLast="0" w:name="_heading=h.573b5or53hoq" w:id="10"/>
+      <w:bookmarkEnd w:id="10"/>
+      <w:r>
+        <w:rPr>
           <w:rtl w:val="0"/>
         </w:rPr>
         <w:t xml:space="preserve">J</w:t>
@@ -3382,16 +4634,14 @@
     </w:p>
     <w:p>
       <w:pPr>
+        <w:pStyle w:val="Heading1"/>
         <w:spacing w:line="240" w:lineRule="auto"/>
-        <w:rPr>
-          <w:sz w:val="32"/>
-          <w:szCs w:val="32"/>
-        </w:rPr>
-      </w:pPr>
-      <w:r>
-        <w:rPr>
-          <w:sz w:val="32"/>
-          <w:szCs w:val="32"/>
+        <w:rPr/>
+      </w:pPr>
+      <w:bookmarkStart w:colFirst="0" w:colLast="0" w:name="_heading=h.26eenggkiure" w:id="11"/>
+      <w:bookmarkEnd w:id="11"/>
+      <w:r>
+        <w:rPr>
           <w:rtl w:val="0"/>
         </w:rPr>
         <w:t xml:space="preserve">K</w:t>
@@ -3399,16 +4649,14 @@
     </w:p>
     <w:p>
       <w:pPr>
+        <w:pStyle w:val="Heading1"/>
         <w:spacing w:line="240" w:lineRule="auto"/>
-        <w:rPr>
-          <w:sz w:val="32"/>
-          <w:szCs w:val="32"/>
-        </w:rPr>
-      </w:pPr>
-      <w:r>
-        <w:rPr>
-          <w:sz w:val="32"/>
-          <w:szCs w:val="32"/>
+        <w:rPr/>
+      </w:pPr>
+      <w:bookmarkStart w:colFirst="0" w:colLast="0" w:name="_heading=h.dqdyltk3noil" w:id="12"/>
+      <w:bookmarkEnd w:id="12"/>
+      <w:r>
+        <w:rPr>
           <w:rtl w:val="0"/>
         </w:rPr>
         <w:t xml:space="preserve">L</w:t>
@@ -3416,16 +4664,14 @@
     </w:p>
     <w:p>
       <w:pPr>
+        <w:pStyle w:val="Heading1"/>
         <w:spacing w:line="240" w:lineRule="auto"/>
-        <w:rPr>
-          <w:sz w:val="32"/>
-          <w:szCs w:val="32"/>
-        </w:rPr>
-      </w:pPr>
-      <w:r>
-        <w:rPr>
-          <w:sz w:val="32"/>
-          <w:szCs w:val="32"/>
+        <w:rPr/>
+      </w:pPr>
+      <w:bookmarkStart w:colFirst="0" w:colLast="0" w:name="_heading=h.qvnplk78jupp" w:id="13"/>
+      <w:bookmarkEnd w:id="13"/>
+      <w:r>
+        <w:rPr>
           <w:rtl w:val="0"/>
         </w:rPr>
         <w:t xml:space="preserve">M</w:t>
@@ -3769,16 +5015,14 @@
     </w:p>
     <w:p>
       <w:pPr>
+        <w:pStyle w:val="Heading1"/>
         <w:spacing w:line="240" w:lineRule="auto"/>
-        <w:rPr>
-          <w:sz w:val="32"/>
-          <w:szCs w:val="32"/>
-        </w:rPr>
-      </w:pPr>
-      <w:r>
-        <w:rPr>
-          <w:sz w:val="32"/>
-          <w:szCs w:val="32"/>
+        <w:rPr/>
+      </w:pPr>
+      <w:bookmarkStart w:colFirst="0" w:colLast="0" w:name="_heading=h.tghf84p1fmv" w:id="14"/>
+      <w:bookmarkEnd w:id="14"/>
+      <w:r>
+        <w:rPr>
           <w:rtl w:val="0"/>
         </w:rPr>
         <w:t xml:space="preserve">N</w:t>
@@ -3786,16 +5030,14 @@
     </w:p>
     <w:p>
       <w:pPr>
+        <w:pStyle w:val="Heading1"/>
         <w:spacing w:line="240" w:lineRule="auto"/>
-        <w:rPr>
-          <w:sz w:val="32"/>
-          <w:szCs w:val="32"/>
-        </w:rPr>
-      </w:pPr>
-      <w:r>
-        <w:rPr>
-          <w:sz w:val="32"/>
-          <w:szCs w:val="32"/>
+        <w:rPr/>
+      </w:pPr>
+      <w:bookmarkStart w:colFirst="0" w:colLast="0" w:name="_heading=h.rywap1dyhx3h" w:id="15"/>
+      <w:bookmarkEnd w:id="15"/>
+      <w:r>
+        <w:rPr>
           <w:rtl w:val="0"/>
         </w:rPr>
         <w:t xml:space="preserve">O</w:t>
@@ -3803,16 +5045,14 @@
     </w:p>
     <w:p>
       <w:pPr>
+        <w:pStyle w:val="Heading1"/>
         <w:spacing w:line="240" w:lineRule="auto"/>
-        <w:rPr>
-          <w:sz w:val="32"/>
-          <w:szCs w:val="32"/>
-        </w:rPr>
-      </w:pPr>
-      <w:r>
-        <w:rPr>
-          <w:sz w:val="32"/>
-          <w:szCs w:val="32"/>
+        <w:rPr/>
+      </w:pPr>
+      <w:bookmarkStart w:colFirst="0" w:colLast="0" w:name="_heading=h.cfep3z3ap20y" w:id="16"/>
+      <w:bookmarkEnd w:id="16"/>
+      <w:r>
+        <w:rPr>
           <w:rtl w:val="0"/>
         </w:rPr>
         <w:t xml:space="preserve">P</w:t>
@@ -3959,32 +5199,6 @@
       </w:pPr>
       <w:r>
         <w:rPr>
-          <w:rtl w:val="0"/>
-        </w:rPr>
-      </w:r>
-    </w:p>
-    <w:p>
-      <w:pPr>
-        <w:rPr>
-          <w:sz w:val="28"/>
-          <w:szCs w:val="28"/>
-        </w:rPr>
-      </w:pPr>
-      <w:r>
-        <w:rPr>
-          <w:rtl w:val="0"/>
-        </w:rPr>
-      </w:r>
-    </w:p>
-    <w:p>
-      <w:pPr>
-        <w:rPr>
-          <w:sz w:val="28"/>
-          <w:szCs w:val="28"/>
-        </w:rPr>
-      </w:pPr>
-      <w:r>
-        <w:rPr>
           <w:sz w:val="28"/>
           <w:szCs w:val="28"/>
           <w:rtl w:val="0"/>
@@ -4058,16 +5272,14 @@
     </w:p>
     <w:p>
       <w:pPr>
+        <w:pStyle w:val="Heading1"/>
         <w:spacing w:line="240" w:lineRule="auto"/>
-        <w:rPr>
-          <w:sz w:val="32"/>
-          <w:szCs w:val="32"/>
-        </w:rPr>
-      </w:pPr>
-      <w:r>
-        <w:rPr>
-          <w:sz w:val="32"/>
-          <w:szCs w:val="32"/>
+        <w:rPr/>
+      </w:pPr>
+      <w:bookmarkStart w:colFirst="0" w:colLast="0" w:name="_heading=h.94ef2uw5eevc" w:id="17"/>
+      <w:bookmarkEnd w:id="17"/>
+      <w:r>
+        <w:rPr>
           <w:rtl w:val="0"/>
         </w:rPr>
         <w:t xml:space="preserve">Q</w:t>
@@ -4115,16 +5327,28 @@
     </w:p>
     <w:p>
       <w:pPr>
+        <w:pStyle w:val="Heading1"/>
         <w:spacing w:line="240" w:lineRule="auto"/>
-        <w:rPr>
-          <w:sz w:val="32"/>
-          <w:szCs w:val="32"/>
-        </w:rPr>
-      </w:pPr>
-      <w:r>
-        <w:rPr>
-          <w:sz w:val="32"/>
-          <w:szCs w:val="32"/>
+        <w:rPr/>
+      </w:pPr>
+      <w:bookmarkStart w:colFirst="0" w:colLast="0" w:name="_heading=h.la12jqs8ddza" w:id="18"/>
+      <w:bookmarkEnd w:id="18"/>
+      <w:r>
+        <w:rPr>
+          <w:rtl w:val="0"/>
+        </w:rPr>
+      </w:r>
+    </w:p>
+    <w:p>
+      <w:pPr>
+        <w:pStyle w:val="Heading1"/>
+        <w:spacing w:line="240" w:lineRule="auto"/>
+        <w:rPr/>
+      </w:pPr>
+      <w:bookmarkStart w:colFirst="0" w:colLast="0" w:name="_heading=h.q7r8nrpvnmia" w:id="19"/>
+      <w:bookmarkEnd w:id="19"/>
+      <w:r>
+        <w:rPr>
           <w:rtl w:val="0"/>
         </w:rPr>
         <w:t xml:space="preserve">R</w:t>
@@ -4304,16 +5528,14 @@
     </w:p>
     <w:p>
       <w:pPr>
+        <w:pStyle w:val="Heading1"/>
         <w:spacing w:line="240" w:lineRule="auto"/>
-        <w:rPr>
-          <w:sz w:val="32"/>
-          <w:szCs w:val="32"/>
-        </w:rPr>
-      </w:pPr>
-      <w:r>
-        <w:rPr>
-          <w:sz w:val="32"/>
-          <w:szCs w:val="32"/>
+        <w:rPr/>
+      </w:pPr>
+      <w:bookmarkStart w:colFirst="0" w:colLast="0" w:name="_heading=h.xhdg4po99hpl" w:id="20"/>
+      <w:bookmarkEnd w:id="20"/>
+      <w:r>
+        <w:rPr>
           <w:rtl w:val="0"/>
         </w:rPr>
         <w:t xml:space="preserve">S</w:t>
@@ -4607,16 +5829,14 @@
     </w:p>
     <w:p>
       <w:pPr>
+        <w:pStyle w:val="Heading1"/>
         <w:spacing w:line="240" w:lineRule="auto"/>
-        <w:rPr>
-          <w:sz w:val="32"/>
-          <w:szCs w:val="32"/>
-        </w:rPr>
-      </w:pPr>
-      <w:r>
-        <w:rPr>
-          <w:sz w:val="32"/>
-          <w:szCs w:val="32"/>
+        <w:rPr/>
+      </w:pPr>
+      <w:bookmarkStart w:colFirst="0" w:colLast="0" w:name="_heading=h.vfz5o2qh4b85" w:id="21"/>
+      <w:bookmarkEnd w:id="21"/>
+      <w:r>
+        <w:rPr>
           <w:rtl w:val="0"/>
         </w:rPr>
         <w:t xml:space="preserve">T</w:t>
@@ -4704,16 +5924,14 @@
     </w:p>
     <w:p>
       <w:pPr>
+        <w:pStyle w:val="Heading1"/>
         <w:spacing w:line="240" w:lineRule="auto"/>
-        <w:rPr>
-          <w:sz w:val="32"/>
-          <w:szCs w:val="32"/>
-        </w:rPr>
-      </w:pPr>
-      <w:r>
-        <w:rPr>
-          <w:sz w:val="32"/>
-          <w:szCs w:val="32"/>
+        <w:rPr/>
+      </w:pPr>
+      <w:bookmarkStart w:colFirst="0" w:colLast="0" w:name="_heading=h.j7wx9x8lp11c" w:id="22"/>
+      <w:bookmarkEnd w:id="22"/>
+      <w:r>
+        <w:rPr>
           <w:rtl w:val="0"/>
         </w:rPr>
         <w:t xml:space="preserve">U</w:t>
@@ -4766,16 +5984,13 @@
     </w:p>
     <w:p>
       <w:pPr>
-        <w:ind w:left="0" w:firstLine="0"/>
-        <w:rPr>
-          <w:sz w:val="32"/>
-          <w:szCs w:val="32"/>
-        </w:rPr>
-      </w:pPr>
-      <w:r>
-        <w:rPr>
-          <w:sz w:val="32"/>
-          <w:szCs w:val="32"/>
+        <w:pStyle w:val="Heading1"/>
+        <w:rPr/>
+      </w:pPr>
+      <w:bookmarkStart w:colFirst="0" w:colLast="0" w:name="_heading=h.z9uf1ek4mlbp" w:id="23"/>
+      <w:bookmarkEnd w:id="23"/>
+      <w:r>
+        <w:rPr>
           <w:rtl w:val="0"/>
         </w:rPr>
         <w:t xml:space="preserve">V</w:t>
@@ -4913,16 +6128,14 @@
     </w:p>
     <w:p>
       <w:pPr>
+        <w:pStyle w:val="Heading1"/>
         <w:spacing w:line="240" w:lineRule="auto"/>
-        <w:rPr>
-          <w:sz w:val="32"/>
-          <w:szCs w:val="32"/>
-        </w:rPr>
-      </w:pPr>
-      <w:r>
-        <w:rPr>
-          <w:sz w:val="32"/>
-          <w:szCs w:val="32"/>
+        <w:rPr/>
+      </w:pPr>
+      <w:bookmarkStart w:colFirst="0" w:colLast="0" w:name="_heading=h.d7omphel29yk" w:id="24"/>
+      <w:bookmarkEnd w:id="24"/>
+      <w:r>
+        <w:rPr>
           <w:rtl w:val="0"/>
         </w:rPr>
         <w:t xml:space="preserve">W</w:t>
@@ -5073,55 +6286,47 @@
     </w:p>
     <w:p>
       <w:pPr>
-        <w:spacing w:line="240" w:lineRule="auto"/>
-        <w:rPr>
-          <w:sz w:val="32"/>
-          <w:szCs w:val="32"/>
-        </w:rPr>
-      </w:pPr>
-      <w:r>
-        <w:rPr>
-          <w:sz w:val="32"/>
-          <w:szCs w:val="32"/>
-          <w:rtl w:val="0"/>
-        </w:rPr>
-        <w:t xml:space="preserve">X</w:t>
-      </w:r>
-    </w:p>
-    <w:p>
-      <w:pPr>
-        <w:spacing w:line="240" w:lineRule="auto"/>
-        <w:rPr>
-          <w:sz w:val="32"/>
-          <w:szCs w:val="32"/>
-        </w:rPr>
-      </w:pPr>
-      <w:r>
-        <w:rPr>
-          <w:sz w:val="32"/>
-          <w:szCs w:val="32"/>
-          <w:rtl w:val="0"/>
-        </w:rPr>
-        <w:t xml:space="preserve">Y</w:t>
-      </w:r>
-    </w:p>
-    <w:p>
-      <w:pPr>
+        <w:pStyle w:val="Heading1"/>
         <w:spacing w:line="240" w:lineRule="auto"/>
         <w:rPr/>
       </w:pPr>
-      <w:r>
-        <w:rPr>
-          <w:sz w:val="32"/>
-          <w:szCs w:val="32"/>
+      <w:bookmarkStart w:colFirst="0" w:colLast="0" w:name="_heading=h.raz4gnk7qb3c" w:id="25"/>
+      <w:bookmarkEnd w:id="25"/>
+      <w:r>
+        <w:rPr>
+          <w:rtl w:val="0"/>
+        </w:rPr>
+        <w:t xml:space="preserve">X</w:t>
+      </w:r>
+    </w:p>
+    <w:p>
+      <w:pPr>
+        <w:pStyle w:val="Heading1"/>
+        <w:spacing w:line="240" w:lineRule="auto"/>
+        <w:rPr/>
+      </w:pPr>
+      <w:bookmarkStart w:colFirst="0" w:colLast="0" w:name="_heading=h.n5z2xkyvg9ok" w:id="26"/>
+      <w:bookmarkEnd w:id="26"/>
+      <w:r>
+        <w:rPr>
+          <w:rtl w:val="0"/>
+        </w:rPr>
+        <w:t xml:space="preserve">Y</w:t>
+      </w:r>
+    </w:p>
+    <w:p>
+      <w:pPr>
+        <w:pStyle w:val="Heading1"/>
+        <w:spacing w:line="240" w:lineRule="auto"/>
+        <w:rPr/>
+      </w:pPr>
+      <w:bookmarkStart w:colFirst="0" w:colLast="0" w:name="_heading=h.dmwsict6wzgi" w:id="27"/>
+      <w:bookmarkEnd w:id="27"/>
+      <w:r>
+        <w:rPr>
           <w:rtl w:val="0"/>
         </w:rPr>
         <w:t xml:space="preserve">Z</w:t>
-      </w:r>
-      <w:r>
-        <w:rPr>
-          <w:rtl w:val="0"/>
-        </w:rPr>
       </w:r>
     </w:p>
     <w:p>
@@ -6779,7 +7984,7 @@
 
 <file path=customXML/item1.xml><?xml version="1.0" encoding="utf-8"?>
 <go:gDocsCustomXmlDataStorage xmlns:go="http://customooxmlschemas.google.com/" xmlns:r="http://schemas.openxmlformats.org/officeDocument/2006/relationships">
-  <go:docsCustomData xmlns:go="http://customooxmlschemas.google.com/" roundtripDataSignature="AMtx7miXYX5BMuoxuF3Sg0ooQ5HvM8jT2Q==">AMUW2mXoWMjgdfom8YLNks11zAurx11lsN/Db33m90x6RSUEYAWDXs9GqoC3j7FvI55CauCQmmEO1R1Wf7sTkXBBe4cZ+zrr7ZQSBdXD69EzUanoBkvqrs2dSiGoA5xqWKbKSnde+6cL</go:docsCustomData>
+  <go:docsCustomData xmlns:go="http://customooxmlschemas.google.com/" roundtripDataSignature="AMtx7mhG6QIHGnG0q5gvWqzXgyu4uvBd/Q==">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</go:docsCustomData>
 </go:gDocsCustomXmlDataStorage>
 </file>
 

</xml_diff>